<commit_message>
Updated week 17 reflective assignment
</commit_message>
<xml_diff>
--- a/Portfolio/Week_17/Week 17 reflective assignment.docx
+++ b/Portfolio/Week_17/Week 17 reflective assignment.docx
@@ -382,19 +382,11 @@
         </w:rPr>
         <w:t xml:space="preserve"> </w:t>
       </w:r>
-      <w:proofErr w:type="spellStart"/>
-      <w:r>
-        <w:rPr>
-          <w:lang w:val="en-US"/>
-        </w:rPr>
-        <w:t>digitisation</w:t>
-      </w:r>
-      <w:proofErr w:type="spellEnd"/>
-      <w:r>
-        <w:rPr>
-          <w:lang w:val="en-US"/>
-        </w:rPr>
-        <w:t xml:space="preserve">. Unlike analogue archives, where materials are broadly accessible, digital archives only contain a </w:t>
+      <w:r>
+        <w:rPr>
+          <w:lang w:val="en-US"/>
+        </w:rPr>
+        <w:t xml:space="preserve">digitisation. Unlike analogue archives, where materials are broadly accessible, digital archives only contain a </w:t>
       </w:r>
       <w:r>
         <w:rPr>
@@ -833,21 +825,7 @@
         <w:rPr>
           <w:lang w:val="en-US"/>
         </w:rPr>
-        <w:t xml:space="preserve"> interpretations of the material before historians encounter the sources themselves. As a result, research becomes influenced by how information is </w:t>
-      </w:r>
-      <w:proofErr w:type="spellStart"/>
-      <w:r>
-        <w:rPr>
-          <w:lang w:val="en-US"/>
-        </w:rPr>
-        <w:t>organised</w:t>
-      </w:r>
-      <w:proofErr w:type="spellEnd"/>
-      <w:r>
-        <w:rPr>
-          <w:lang w:val="en-US"/>
-        </w:rPr>
-        <w:t xml:space="preserve"> and retrieved, rather than by the historian’s questions. Jensen’s framework highlights that historians must critically assess these tools, as they actively shape historical knowledge. </w:t>
+        <w:t xml:space="preserve"> interpretations of the material before historians encounter the sources themselves. As a result, research becomes influenced by how information is organised and retrieved, rather than by the historian’s questions. Jensen’s framework highlights that historians must critically assess these tools, as they actively shape historical knowledge. </w:t>
       </w:r>
     </w:p>
     <w:p>
@@ -1325,7 +1303,13 @@
         <w:rPr>
           <w:lang w:val="en-US"/>
         </w:rPr>
-        <w:t xml:space="preserve">What are the implications of using interview recordings as a historical source? </w:t>
+        <w:t>T</w:t>
+      </w:r>
+      <w:r>
+        <w:rPr>
+          <w:lang w:val="en-US"/>
+        </w:rPr>
+        <w:t>he implications of using interview recordings as a historical source</w:t>
       </w:r>
     </w:p>
     <w:p>
@@ -1387,38 +1371,44 @@
         <w:rPr>
           <w:lang w:val="en-US"/>
         </w:rPr>
+        <w:t xml:space="preserve">Interview recordings </w:t>
+      </w:r>
+      <w:r>
+        <w:rPr>
+          <w:lang w:val="en-US"/>
+        </w:rPr>
+        <w:t>have</w:t>
+      </w:r>
+      <w:r>
+        <w:rPr>
+          <w:lang w:val="en-US"/>
+        </w:rPr>
+        <w:t xml:space="preserve"> an unquantifiable character</w:t>
+      </w:r>
+      <w:r>
+        <w:rPr>
+          <w:lang w:val="en-US"/>
+        </w:rPr>
+        <w:t xml:space="preserve">, which transcripts will never have. The sound of someone’s voice </w:t>
+      </w:r>
+      <w:r>
+        <w:rPr>
+          <w:lang w:val="en-US"/>
+        </w:rPr>
+        <w:t xml:space="preserve">might be able to convey a message </w:t>
+      </w:r>
+      <w:r>
+        <w:rPr>
+          <w:lang w:val="en-US"/>
+        </w:rPr>
+        <w:t xml:space="preserve">by itself, which would take a lot </w:t>
+      </w:r>
+      <w:r>
+        <w:rPr>
+          <w:lang w:val="en-US"/>
+        </w:rPr>
         <w:lastRenderedPageBreak/>
-        <w:t xml:space="preserve">Interview recordings </w:t>
-      </w:r>
-      <w:r>
-        <w:rPr>
-          <w:lang w:val="en-US"/>
-        </w:rPr>
-        <w:t>have</w:t>
-      </w:r>
-      <w:r>
-        <w:rPr>
-          <w:lang w:val="en-US"/>
-        </w:rPr>
-        <w:t xml:space="preserve"> an unquantifiable character</w:t>
-      </w:r>
-      <w:r>
-        <w:rPr>
-          <w:lang w:val="en-US"/>
-        </w:rPr>
-        <w:t xml:space="preserve">, which transcripts will never have. The sound of someone’s voice </w:t>
-      </w:r>
-      <w:r>
-        <w:rPr>
-          <w:lang w:val="en-US"/>
-        </w:rPr>
-        <w:t xml:space="preserve">might be able to convey a message </w:t>
-      </w:r>
-      <w:r>
-        <w:rPr>
-          <w:lang w:val="en-US"/>
-        </w:rPr>
-        <w:t>by itself, which would take a lot of explanation to write down in a transcript.</w:t>
+        <w:t>of explanation to write down in a transcript.</w:t>
       </w:r>
       <w:r>
         <w:rPr>
@@ -1751,20 +1741,16 @@
     <w:p>
       <w:pPr>
         <w:rPr>
-          <w:lang w:val="en-US"/>
-        </w:rPr>
-      </w:pPr>
-      <w:r>
-        <w:rPr>
           <w:b/>
           <w:bCs/>
           <w:i/>
           <w:iCs/>
           <w:lang w:val="en-US"/>
         </w:rPr>
-        <w:t>Part 3</w:t>
-      </w:r>
-      <w:r>
+      </w:pPr>
+    </w:p>
+    <w:p>
+      <w:pPr>
         <w:rPr>
           <w:b/>
           <w:bCs/>
@@ -1772,9 +1758,10 @@
           <w:iCs/>
           <w:lang w:val="en-US"/>
         </w:rPr>
-        <w:t> </w:t>
-      </w:r>
-      <w:r>
+      </w:pPr>
+    </w:p>
+    <w:p>
+      <w:pPr>
         <w:rPr>
           <w:b/>
           <w:bCs/>
@@ -1782,342 +1769,40 @@
           <w:iCs/>
           <w:lang w:val="en-US"/>
         </w:rPr>
-        <w:t>Manuel and Conrad</w:t>
-      </w:r>
+      </w:pPr>
     </w:p>
     <w:p>
       <w:pPr>
         <w:rPr>
-          <w:lang w:val="en-US"/>
-        </w:rPr>
-      </w:pPr>
-      <w:r>
-        <w:rPr>
-          <w:lang w:val="en-US"/>
-        </w:rPr>
-        <w:t xml:space="preserve">Historical research </w:t>
-      </w:r>
-      <w:r>
-        <w:rPr>
-          <w:lang w:val="en-US"/>
-        </w:rPr>
-        <w:t xml:space="preserve">in the digital age requires an understanding of how the </w:t>
-      </w:r>
-      <w:r>
-        <w:rPr>
-          <w:lang w:val="en-US"/>
-        </w:rPr>
-        <w:t>media</w:t>
-      </w:r>
-      <w:r>
-        <w:rPr>
-          <w:lang w:val="en-US"/>
-        </w:rPr>
-        <w:t xml:space="preserve"> shapes </w:t>
-      </w:r>
-      <w:r>
-        <w:rPr>
-          <w:lang w:val="en-US"/>
-        </w:rPr>
-        <w:t xml:space="preserve">the source’s message. To conduct </w:t>
-      </w:r>
-      <w:r>
-        <w:rPr>
-          <w:lang w:val="en-US"/>
-        </w:rPr>
-        <w:t>thorough research, historians must distinguish between digitized historical</w:t>
-      </w:r>
-      <w:r>
-        <w:rPr>
-          <w:lang w:val="en-US"/>
-        </w:rPr>
-        <w:t xml:space="preserve"> sources and reborn digital sources. Digitized historical sources are </w:t>
-      </w:r>
-      <w:r>
-        <w:rPr>
-          <w:lang w:val="en-US"/>
-        </w:rPr>
-        <w:t xml:space="preserve">analogue sources converted to digital formats. Reborn digital sources are </w:t>
-      </w:r>
-      <w:r>
-        <w:rPr>
-          <w:lang w:val="en-US"/>
-        </w:rPr>
-        <w:t xml:space="preserve">created digitally </w:t>
-      </w:r>
-      <w:r>
-        <w:rPr>
-          <w:lang w:val="en-US"/>
-        </w:rPr>
-        <w:lastRenderedPageBreak/>
-        <w:t xml:space="preserve">and preserved in digital archives. </w:t>
-      </w:r>
-      <w:r>
-        <w:rPr>
-          <w:lang w:val="en-US"/>
-        </w:rPr>
-        <w:t xml:space="preserve">While </w:t>
-      </w:r>
-      <w:r>
-        <w:rPr>
-          <w:lang w:val="en-US"/>
-        </w:rPr>
-        <w:t>both</w:t>
-      </w:r>
-      <w:r>
-        <w:rPr>
-          <w:lang w:val="en-US"/>
-        </w:rPr>
-        <w:t xml:space="preserve"> require what </w:t>
-      </w:r>
-      <w:r>
-        <w:rPr>
-          <w:lang w:val="en-US"/>
-        </w:rPr>
-        <w:t xml:space="preserve">Helle Strandgaard Jensen calls </w:t>
-      </w:r>
-      <w:r>
-        <w:rPr>
-          <w:lang w:val="en-US"/>
-        </w:rPr>
-        <w:t xml:space="preserve">“digital archival literacy,” they </w:t>
-      </w:r>
-      <w:r>
-        <w:rPr>
-          <w:lang w:val="en-US"/>
-        </w:rPr>
-        <w:t>present</w:t>
-      </w:r>
-      <w:r>
-        <w:rPr>
-          <w:lang w:val="en-US"/>
-        </w:rPr>
-        <w:t xml:space="preserve"> their own,</w:t>
-      </w:r>
-      <w:r>
-        <w:rPr>
-          <w:lang w:val="en-US"/>
-        </w:rPr>
-        <w:t xml:space="preserve"> </w:t>
-      </w:r>
-      <w:r>
-        <w:rPr>
-          <w:lang w:val="en-US"/>
-        </w:rPr>
-        <w:t>distinct challenges</w:t>
-      </w:r>
-      <w:r>
-        <w:rPr>
-          <w:lang w:val="en-US"/>
-        </w:rPr>
-        <w:t>.</w:t>
-      </w:r>
-      <w:r>
-        <w:rPr>
-          <w:rStyle w:val="Fodnotehenvisning"/>
-          <w:lang w:val="en-US"/>
-        </w:rPr>
-        <w:footnoteReference w:id="3"/>
-      </w:r>
+          <w:b/>
+          <w:bCs/>
+          <w:i/>
+          <w:iCs/>
+          <w:lang w:val="en-US"/>
+        </w:rPr>
+      </w:pPr>
     </w:p>
     <w:p>
       <w:pPr>
-        <w:pStyle w:val="Overskrift2"/>
-        <w:rPr>
-          <w:lang w:val="en-US"/>
-        </w:rPr>
-      </w:pPr>
-      <w:r>
-        <w:rPr>
-          <w:lang w:val="en-US"/>
-        </w:rPr>
-        <w:t>Should these sources be treated differently when conducting historical research?</w:t>
-      </w:r>
+        <w:rPr>
+          <w:b/>
+          <w:bCs/>
+          <w:i/>
+          <w:iCs/>
+          <w:lang w:val="en-US"/>
+        </w:rPr>
+      </w:pPr>
     </w:p>
     <w:p>
       <w:pPr>
         <w:rPr>
-          <w:lang w:val="en-US"/>
-        </w:rPr>
-      </w:pPr>
-      <w:r>
-        <w:rPr>
-          <w:lang w:val="en-US"/>
-        </w:rPr>
-        <w:t>They shall indeed be treated differently</w:t>
-      </w:r>
-      <w:r>
-        <w:rPr>
-          <w:lang w:val="en-US"/>
-        </w:rPr>
-        <w:t>,</w:t>
-      </w:r>
-      <w:r>
-        <w:rPr>
-          <w:lang w:val="en-US"/>
-        </w:rPr>
-        <w:t xml:space="preserve"> even though they</w:t>
-      </w:r>
-      <w:r>
-        <w:rPr>
-          <w:lang w:val="en-US"/>
-        </w:rPr>
-        <w:t xml:space="preserve"> both </w:t>
-      </w:r>
-      <w:r>
-        <w:rPr>
-          <w:lang w:val="en-US"/>
-        </w:rPr>
-        <w:t>demand what Jensen calls</w:t>
-      </w:r>
-      <w:r>
-        <w:rPr>
-          <w:lang w:val="en-US"/>
-        </w:rPr>
-        <w:t xml:space="preserve"> </w:t>
-      </w:r>
-      <w:r>
-        <w:rPr>
-          <w:lang w:val="en-US"/>
-        </w:rPr>
-        <w:t>“digital</w:t>
-      </w:r>
-      <w:r>
-        <w:rPr>
-          <w:lang w:val="en-US"/>
-        </w:rPr>
-        <w:t xml:space="preserve"> archival literacy</w:t>
-      </w:r>
-      <w:r>
-        <w:rPr>
-          <w:lang w:val="en-US"/>
-        </w:rPr>
-        <w:t>.</w:t>
-      </w:r>
-      <w:r>
-        <w:rPr>
-          <w:lang w:val="en-US"/>
-        </w:rPr>
-        <w:t>”</w:t>
-      </w:r>
-      <w:r>
-        <w:rPr>
-          <w:rStyle w:val="Fodnotehenvisning"/>
-          <w:lang w:val="en-US"/>
-        </w:rPr>
-        <w:footnoteReference w:id="4"/>
-      </w:r>
-      <w:r>
-        <w:rPr>
-          <w:lang w:val="en-US"/>
-        </w:rPr>
-        <w:t xml:space="preserve"> </w:t>
-      </w:r>
-      <w:r>
-        <w:rPr>
-          <w:lang w:val="en-US"/>
-        </w:rPr>
-        <w:t xml:space="preserve">When using digitized historical sources, the historian </w:t>
-      </w:r>
-      <w:r>
-        <w:rPr>
-          <w:lang w:val="en-US"/>
-        </w:rPr>
-        <w:t>must be aware of the economics and politics behind the decisions about</w:t>
-      </w:r>
-      <w:r>
-        <w:rPr>
-          <w:lang w:val="en-US"/>
-        </w:rPr>
-        <w:t xml:space="preserve"> what </w:t>
-      </w:r>
-      <w:r>
-        <w:rPr>
-          <w:lang w:val="en-US"/>
-        </w:rPr>
-        <w:t xml:space="preserve">should be digitized and how it was done. </w:t>
-      </w:r>
-      <w:r>
-        <w:rPr>
-          <w:lang w:val="en-US"/>
-        </w:rPr>
-        <w:t xml:space="preserve">For example, </w:t>
-      </w:r>
-      <w:r>
-        <w:rPr>
-          <w:lang w:val="en-US"/>
-        </w:rPr>
-        <w:t xml:space="preserve">a company might choose to focus on digitizing </w:t>
-      </w:r>
-      <w:r>
-        <w:rPr>
-          <w:lang w:val="en-US"/>
-        </w:rPr>
-        <w:t>positive</w:t>
-      </w:r>
-      <w:r>
-        <w:rPr>
-          <w:lang w:val="en-US"/>
-        </w:rPr>
-        <w:t xml:space="preserve"> stories about them rather than their controversies. </w:t>
-      </w:r>
-      <w:r>
-        <w:rPr>
-          <w:lang w:val="en-US"/>
-        </w:rPr>
-        <w:t>Jessica Marie Johnson</w:t>
-      </w:r>
-      <w:r>
-        <w:rPr>
-          <w:lang w:val="en-US"/>
-        </w:rPr>
-        <w:t xml:space="preserve"> critiques the “</w:t>
-      </w:r>
-      <w:proofErr w:type="spellStart"/>
-      <w:r>
-        <w:rPr>
-          <w:lang w:val="en-US"/>
-        </w:rPr>
-        <w:t>thingification</w:t>
-      </w:r>
-      <w:proofErr w:type="spellEnd"/>
-      <w:r>
-        <w:rPr>
-          <w:lang w:val="en-US"/>
-        </w:rPr>
-        <w:t xml:space="preserve">” happening when </w:t>
-      </w:r>
-      <w:r>
-        <w:rPr>
-          <w:lang w:val="en-US"/>
-        </w:rPr>
-        <w:t xml:space="preserve">historical sources were digitized </w:t>
-      </w:r>
-      <w:r>
-        <w:rPr>
-          <w:lang w:val="en-US"/>
-        </w:rPr>
-        <w:t xml:space="preserve">and </w:t>
-      </w:r>
-      <w:r>
-        <w:rPr>
-          <w:lang w:val="en-US"/>
-        </w:rPr>
-        <w:t>made into data</w:t>
-      </w:r>
-      <w:r>
-        <w:rPr>
-          <w:lang w:val="en-US"/>
-        </w:rPr>
-        <w:t>.</w:t>
-      </w:r>
-      <w:r>
-        <w:rPr>
-          <w:rStyle w:val="Fodnotehenvisning"/>
-          <w:lang w:val="en-US"/>
-        </w:rPr>
-        <w:footnoteReference w:id="5"/>
-      </w:r>
+          <w:b/>
+          <w:bCs/>
+          <w:i/>
+          <w:iCs/>
+          <w:lang w:val="en-US"/>
+        </w:rPr>
+      </w:pPr>
     </w:p>
     <w:p>
       <w:pPr>
@@ -2125,25 +1810,709 @@
           <w:lang w:val="en-US"/>
         </w:rPr>
       </w:pPr>
+      <w:r>
+        <w:rPr>
+          <w:b/>
+          <w:bCs/>
+          <w:i/>
+          <w:iCs/>
+          <w:lang w:val="en-US"/>
+        </w:rPr>
+        <w:t>Part 3</w:t>
+      </w:r>
+      <w:r>
+        <w:rPr>
+          <w:b/>
+          <w:bCs/>
+          <w:i/>
+          <w:iCs/>
+          <w:lang w:val="en-US"/>
+        </w:rPr>
+        <w:t> </w:t>
+      </w:r>
+      <w:r>
+        <w:rPr>
+          <w:b/>
+          <w:bCs/>
+          <w:i/>
+          <w:iCs/>
+          <w:lang w:val="en-US"/>
+        </w:rPr>
+        <w:t>Manuel and Conrad</w:t>
+      </w:r>
     </w:p>
     <w:p>
       <w:pPr>
-        <w:pStyle w:val="Overskrift2"/>
-        <w:rPr>
-          <w:lang w:val="en-US"/>
-        </w:rPr>
-      </w:pPr>
-      <w:r>
-        <w:rPr>
-          <w:lang w:val="en-US"/>
-        </w:rPr>
-        <w:t>To complete this task, draw on your knowledge of at least two database collections discussed in class and/or your readings.</w:t>
+        <w:rPr>
+          <w:strike/>
+          <w:lang w:val="en-US"/>
+        </w:rPr>
+      </w:pPr>
+      <w:r>
+        <w:rPr>
+          <w:lang w:val="en-US"/>
+        </w:rPr>
+        <w:lastRenderedPageBreak/>
+        <w:t xml:space="preserve">Historical research </w:t>
+      </w:r>
+      <w:r>
+        <w:rPr>
+          <w:lang w:val="en-US"/>
+        </w:rPr>
+        <w:t xml:space="preserve">in the digital age requires an understanding of how the </w:t>
+      </w:r>
+      <w:r>
+        <w:rPr>
+          <w:lang w:val="en-US"/>
+        </w:rPr>
+        <w:t>media</w:t>
+      </w:r>
+      <w:r>
+        <w:rPr>
+          <w:lang w:val="en-US"/>
+        </w:rPr>
+        <w:t xml:space="preserve"> shapes </w:t>
+      </w:r>
+      <w:r>
+        <w:rPr>
+          <w:lang w:val="en-US"/>
+        </w:rPr>
+        <w:t xml:space="preserve">the source’s message. To conduct </w:t>
+      </w:r>
+      <w:r>
+        <w:rPr>
+          <w:lang w:val="en-US"/>
+        </w:rPr>
+        <w:t>thorough research, historians must distinguish between digitized historical</w:t>
+      </w:r>
+      <w:r>
+        <w:rPr>
+          <w:lang w:val="en-US"/>
+        </w:rPr>
+        <w:t xml:space="preserve"> sources and reborn digital sources. Digitized historical sources are </w:t>
+      </w:r>
+      <w:r>
+        <w:rPr>
+          <w:lang w:val="en-US"/>
+        </w:rPr>
+        <w:t xml:space="preserve">analogue sources converted to digital formats. Reborn digital sources are </w:t>
+      </w:r>
+      <w:r>
+        <w:rPr>
+          <w:lang w:val="en-US"/>
+        </w:rPr>
+        <w:t xml:space="preserve">created digitally and preserved in digital archives. </w:t>
       </w:r>
     </w:p>
     <w:p>
       <w:pPr>
+        <w:pStyle w:val="Overskrift2"/>
+        <w:rPr>
+          <w:lang w:val="en-US"/>
+        </w:rPr>
+      </w:pPr>
+      <w:r>
+        <w:rPr>
+          <w:lang w:val="en-US"/>
+        </w:rPr>
+        <w:t xml:space="preserve">Dealing with </w:t>
+      </w:r>
+      <w:r>
+        <w:rPr>
+          <w:lang w:val="en-US"/>
+        </w:rPr>
+        <w:t xml:space="preserve">digitized and reborn-digital sources </w:t>
+      </w:r>
+    </w:p>
+    <w:p>
+      <w:pPr>
+        <w:rPr>
+          <w:lang w:val="en-US"/>
+        </w:rPr>
+      </w:pPr>
+      <w:r>
+        <w:rPr>
+          <w:lang w:val="en-US"/>
+        </w:rPr>
+        <w:t>Different source types demand different analytical frameworks</w:t>
+      </w:r>
+      <w:r>
+        <w:rPr>
+          <w:lang w:val="en-US"/>
+        </w:rPr>
+        <w:t>,</w:t>
+      </w:r>
+      <w:r>
+        <w:rPr>
+          <w:lang w:val="en-US"/>
+        </w:rPr>
+        <w:t xml:space="preserve"> even though they</w:t>
+      </w:r>
+      <w:r>
+        <w:rPr>
+          <w:lang w:val="en-US"/>
+        </w:rPr>
+        <w:t xml:space="preserve"> both </w:t>
+      </w:r>
+      <w:r>
+        <w:rPr>
+          <w:lang w:val="en-US"/>
+        </w:rPr>
+        <w:t xml:space="preserve">demand </w:t>
+      </w:r>
+      <w:r>
+        <w:rPr>
+          <w:lang w:val="en-US"/>
+        </w:rPr>
+        <w:t>what Jensen calls</w:t>
+      </w:r>
+      <w:r>
+        <w:rPr>
+          <w:lang w:val="en-US"/>
+        </w:rPr>
+        <w:t xml:space="preserve"> </w:t>
+      </w:r>
+      <w:r>
+        <w:rPr>
+          <w:lang w:val="en-US"/>
+        </w:rPr>
+        <w:t>“digital</w:t>
+      </w:r>
+      <w:r>
+        <w:rPr>
+          <w:lang w:val="en-US"/>
+        </w:rPr>
+        <w:t xml:space="preserve"> archival literacy</w:t>
+      </w:r>
+      <w:r>
+        <w:rPr>
+          <w:lang w:val="en-US"/>
+        </w:rPr>
+        <w:t>.</w:t>
+      </w:r>
+      <w:r>
+        <w:rPr>
+          <w:lang w:val="en-US"/>
+        </w:rPr>
+        <w:t>”</w:t>
+      </w:r>
+      <w:r>
+        <w:rPr>
+          <w:rStyle w:val="Fodnotehenvisning"/>
+          <w:lang w:val="en-US"/>
+        </w:rPr>
+        <w:footnoteReference w:id="3"/>
+      </w:r>
+      <w:r>
+        <w:rPr>
+          <w:lang w:val="en-US"/>
+        </w:rPr>
+        <w:t xml:space="preserve"> </w:t>
+      </w:r>
+      <w:r>
+        <w:rPr>
+          <w:lang w:val="en-US"/>
+        </w:rPr>
+        <w:t>When using digitized historical sources</w:t>
+      </w:r>
+      <w:r>
+        <w:rPr>
+          <w:lang w:val="en-US"/>
+        </w:rPr>
+        <w:t xml:space="preserve"> such as analogue documents converted into searchable datasets,</w:t>
+      </w:r>
+      <w:r>
+        <w:rPr>
+          <w:lang w:val="en-US"/>
+        </w:rPr>
+        <w:t xml:space="preserve"> historian</w:t>
+      </w:r>
+      <w:r>
+        <w:rPr>
+          <w:lang w:val="en-US"/>
+        </w:rPr>
+        <w:t>s</w:t>
+      </w:r>
+      <w:r>
+        <w:rPr>
+          <w:lang w:val="en-US"/>
+        </w:rPr>
+        <w:t xml:space="preserve"> </w:t>
+      </w:r>
+      <w:r>
+        <w:rPr>
+          <w:lang w:val="en-US"/>
+        </w:rPr>
+        <w:t>must be aware of the economics and politics behind the decisions about</w:t>
+      </w:r>
+      <w:r>
+        <w:rPr>
+          <w:lang w:val="en-US"/>
+        </w:rPr>
+        <w:t xml:space="preserve"> what </w:t>
+      </w:r>
+      <w:r>
+        <w:rPr>
+          <w:lang w:val="en-US"/>
+        </w:rPr>
+        <w:t xml:space="preserve">should be digitized and how it was done. </w:t>
+      </w:r>
+      <w:r>
+        <w:rPr>
+          <w:lang w:val="en-US"/>
+        </w:rPr>
+        <w:t xml:space="preserve">For example, </w:t>
+      </w:r>
+      <w:r>
+        <w:rPr>
+          <w:lang w:val="en-US"/>
+        </w:rPr>
+        <w:t xml:space="preserve">a company might choose to focus on digitizing </w:t>
+      </w:r>
+      <w:r>
+        <w:rPr>
+          <w:lang w:val="en-US"/>
+        </w:rPr>
+        <w:t>positive</w:t>
+      </w:r>
+      <w:r>
+        <w:rPr>
+          <w:lang w:val="en-US"/>
+        </w:rPr>
+        <w:t xml:space="preserve"> stories about them</w:t>
+      </w:r>
+      <w:r>
+        <w:rPr>
+          <w:lang w:val="en-US"/>
+        </w:rPr>
+        <w:t>selves</w:t>
+      </w:r>
+      <w:r>
+        <w:rPr>
+          <w:lang w:val="en-US"/>
+        </w:rPr>
+        <w:t xml:space="preserve"> rather than their </w:t>
+      </w:r>
+      <w:r>
+        <w:rPr>
+          <w:lang w:val="en-US"/>
+        </w:rPr>
+        <w:t>controversies. Furthermore, as</w:t>
+      </w:r>
+      <w:r>
+        <w:rPr>
+          <w:lang w:val="en-US"/>
+        </w:rPr>
+        <w:t xml:space="preserve"> </w:t>
+      </w:r>
+      <w:r>
+        <w:rPr>
+          <w:lang w:val="en-US"/>
+        </w:rPr>
+        <w:t>Jessica Marie Johnson</w:t>
+      </w:r>
+      <w:r>
+        <w:rPr>
+          <w:lang w:val="en-US"/>
+        </w:rPr>
+        <w:t xml:space="preserve"> critiques</w:t>
+      </w:r>
+      <w:r>
+        <w:rPr>
+          <w:lang w:val="en-US"/>
+        </w:rPr>
+        <w:t xml:space="preserve">, the </w:t>
+      </w:r>
+      <w:r>
+        <w:rPr>
+          <w:lang w:val="en-US"/>
+        </w:rPr>
+        <w:t>transformation of analogue to digital risks a</w:t>
+      </w:r>
+      <w:r>
+        <w:rPr>
+          <w:lang w:val="en-US"/>
+        </w:rPr>
+        <w:t xml:space="preserve"> “thingification”</w:t>
+      </w:r>
+      <w:r>
+        <w:rPr>
+          <w:lang w:val="en-US"/>
+        </w:rPr>
+        <w:t>, where complex human lives and stories are reduced to quantifiable and rigid databases</w:t>
+      </w:r>
+      <w:r>
+        <w:rPr>
+          <w:lang w:val="en-US"/>
+        </w:rPr>
+        <w:t>.</w:t>
+      </w:r>
+      <w:r>
+        <w:rPr>
+          <w:rStyle w:val="Fodnotehenvisning"/>
+          <w:lang w:val="en-US"/>
+        </w:rPr>
+        <w:footnoteReference w:id="4"/>
+      </w:r>
+      <w:r>
+        <w:rPr>
+          <w:lang w:val="en-US"/>
+        </w:rPr>
+        <w:t xml:space="preserve"> </w:t>
+      </w:r>
+    </w:p>
+    <w:p>
+      <w:pPr>
+        <w:rPr>
+          <w:lang w:val="en-US"/>
+        </w:rPr>
+      </w:pPr>
+      <w:r>
+        <w:rPr>
+          <w:lang w:val="en-US"/>
+        </w:rPr>
+        <w:t>R</w:t>
+      </w:r>
+      <w:r>
+        <w:rPr>
+          <w:lang w:val="en-US"/>
+        </w:rPr>
+        <w:t>eborn digital sources</w:t>
+      </w:r>
+      <w:r>
+        <w:rPr>
+          <w:lang w:val="en-US"/>
+        </w:rPr>
+        <w:t xml:space="preserve"> such as websites archived on the</w:t>
+      </w:r>
+      <w:r>
+        <w:rPr>
+          <w:lang w:val="en-US"/>
+        </w:rPr>
+        <w:t xml:space="preserve"> Internet Archive’s</w:t>
+      </w:r>
+      <w:r>
+        <w:rPr>
+          <w:lang w:val="en-US"/>
+        </w:rPr>
+        <w:t xml:space="preserve"> </w:t>
+      </w:r>
+      <w:r>
+        <w:rPr>
+          <w:lang w:val="en-US"/>
+        </w:rPr>
+        <w:t>“</w:t>
+      </w:r>
+      <w:r>
+        <w:rPr>
+          <w:lang w:val="en-US"/>
+        </w:rPr>
+        <w:t>Wayback</w:t>
+      </w:r>
+      <w:r>
+        <w:rPr>
+          <w:lang w:val="en-US"/>
+        </w:rPr>
+        <w:t xml:space="preserve"> </w:t>
+      </w:r>
+      <w:r>
+        <w:rPr>
+          <w:lang w:val="en-US"/>
+        </w:rPr>
+        <w:t>Machine</w:t>
+      </w:r>
+      <w:r>
+        <w:rPr>
+          <w:lang w:val="en-US"/>
+        </w:rPr>
+        <w:t>”</w:t>
+      </w:r>
+      <w:r>
+        <w:rPr>
+          <w:lang w:val="en-US"/>
+        </w:rPr>
+        <w:t xml:space="preserve"> </w:t>
+      </w:r>
+      <w:r>
+        <w:rPr>
+          <w:lang w:val="en-US"/>
+        </w:rPr>
+        <w:t xml:space="preserve">should </w:t>
+      </w:r>
+      <w:r>
+        <w:rPr>
+          <w:lang w:val="en-US"/>
+        </w:rPr>
+        <w:t>be</w:t>
+      </w:r>
+      <w:r>
+        <w:rPr>
+          <w:lang w:val="en-US"/>
+        </w:rPr>
+        <w:t xml:space="preserve"> treated</w:t>
+      </w:r>
+      <w:r>
+        <w:rPr>
+          <w:lang w:val="en-US"/>
+        </w:rPr>
+        <w:t xml:space="preserve"> with the same </w:t>
+      </w:r>
+      <w:r>
+        <w:rPr>
+          <w:lang w:val="en-US"/>
+        </w:rPr>
+        <w:t xml:space="preserve">amount of </w:t>
+      </w:r>
+      <w:r>
+        <w:rPr>
+          <w:lang w:val="en-US"/>
+        </w:rPr>
+        <w:t>care as digitized sources</w:t>
+      </w:r>
+      <w:r>
+        <w:rPr>
+          <w:lang w:val="en-US"/>
+        </w:rPr>
+        <w:t>.</w:t>
+      </w:r>
+      <w:r>
+        <w:rPr>
+          <w:lang w:val="en-US"/>
+        </w:rPr>
+        <w:t xml:space="preserve"> They do, however, demand an entirely different methodology.</w:t>
+      </w:r>
+      <w:r>
+        <w:rPr>
+          <w:lang w:val="en-US"/>
+        </w:rPr>
+        <w:t xml:space="preserve"> As </w:t>
+      </w:r>
+      <w:r>
+        <w:rPr>
+          <w:lang w:val="en-US"/>
+        </w:rPr>
+        <w:t>Niels Brügger</w:t>
+      </w:r>
+      <w:r>
+        <w:rPr>
+          <w:lang w:val="en-US"/>
+        </w:rPr>
+        <w:t xml:space="preserve"> demonstrates, an archived webpage is not a direct clone of the original source, but a </w:t>
+      </w:r>
+      <w:r>
+        <w:rPr>
+          <w:i/>
+          <w:iCs/>
+          <w:lang w:val="en-US"/>
+        </w:rPr>
+        <w:t>reconstructed</w:t>
+      </w:r>
+      <w:r>
+        <w:rPr>
+          <w:lang w:val="en-US"/>
+        </w:rPr>
+        <w:t xml:space="preserve"> source</w:t>
+      </w:r>
+      <w:r>
+        <w:rPr>
+          <w:lang w:val="en-US"/>
+        </w:rPr>
+        <w:t>, reassembled through automated web crawlers.</w:t>
+      </w:r>
+      <w:r>
+        <w:rPr>
+          <w:rStyle w:val="Fodnotehenvisning"/>
+          <w:lang w:val="en-US"/>
+        </w:rPr>
+        <w:footnoteReference w:id="5"/>
+      </w:r>
+      <w:r>
+        <w:rPr>
+          <w:lang w:val="en-US"/>
+        </w:rPr>
+        <w:t xml:space="preserve"> Therefore, historians analyzing </w:t>
+      </w:r>
+      <w:r>
+        <w:rPr>
+          <w:lang w:val="en-US"/>
+        </w:rPr>
+        <w:t>reborn digital sources must not treat them like fixed paper documents</w:t>
+      </w:r>
+      <w:r>
+        <w:rPr>
+          <w:lang w:val="en-US"/>
+        </w:rPr>
+        <w:t>, but investigate the technical preservation pipeline.</w:t>
+      </w:r>
+      <w:r>
+        <w:rPr>
+          <w:lang w:val="en-US"/>
+        </w:rPr>
+        <w:t xml:space="preserve"> This can be done by </w:t>
+      </w:r>
+      <w:r>
+        <w:rPr>
+          <w:lang w:val="en-US"/>
+        </w:rPr>
+        <w:t>questioning which components</w:t>
+      </w:r>
+      <w:r>
+        <w:rPr>
+          <w:lang w:val="en-US"/>
+        </w:rPr>
+        <w:t xml:space="preserve"> of the site</w:t>
+      </w:r>
+      <w:r>
+        <w:rPr>
+          <w:lang w:val="en-US"/>
+        </w:rPr>
+        <w:t xml:space="preserve"> were captured, altered, or lost</w:t>
+      </w:r>
+      <w:r>
+        <w:rPr>
+          <w:lang w:val="en-US"/>
+        </w:rPr>
+        <w:t>. Because web crawlers gather site files</w:t>
+      </w:r>
+      <w:r>
+        <w:rPr>
+          <w:lang w:val="en-US"/>
+        </w:rPr>
+        <w:t xml:space="preserve"> with temporal inconsistency</w:t>
+      </w:r>
+      <w:r>
+        <w:rPr>
+          <w:lang w:val="en-US"/>
+        </w:rPr>
+        <w:t>, an archived page may also</w:t>
+      </w:r>
+      <w:r>
+        <w:rPr>
+          <w:lang w:val="en-US"/>
+        </w:rPr>
+        <w:t xml:space="preserve"> have combined elements captured on different dates into one </w:t>
+      </w:r>
+      <w:r>
+        <w:rPr>
+          <w:lang w:val="en-US"/>
+        </w:rPr>
+        <w:t>page, which never actually existed.</w:t>
+      </w:r>
+      <w:r>
+        <w:rPr>
+          <w:lang w:val="en-US"/>
+        </w:rPr>
+        <w:t xml:space="preserve"> While web archives serve as a prominent example, Brügger emphasizes that reborn digital sources </w:t>
+      </w:r>
+      <w:r>
+        <w:rPr>
+          <w:lang w:val="en-US"/>
+        </w:rPr>
+        <w:t>can</w:t>
+      </w:r>
+      <w:r>
+        <w:rPr>
+          <w:lang w:val="en-US"/>
+        </w:rPr>
+        <w:t xml:space="preserve"> encompass</w:t>
+      </w:r>
+      <w:r>
+        <w:rPr>
+          <w:lang w:val="en-US"/>
+        </w:rPr>
+        <w:t xml:space="preserve"> more</w:t>
+      </w:r>
+      <w:r>
+        <w:rPr>
+          <w:lang w:val="en-US"/>
+        </w:rPr>
+        <w:t xml:space="preserve"> than that</w:t>
+      </w:r>
+      <w:r>
+        <w:rPr>
+          <w:lang w:val="en-US"/>
+        </w:rPr>
+        <w:t>, such as</w:t>
+      </w:r>
+      <w:r>
+        <w:rPr>
+          <w:lang w:val="en-US"/>
+        </w:rPr>
+        <w:t xml:space="preserve"> </w:t>
+      </w:r>
+      <w:r>
+        <w:rPr>
+          <w:lang w:val="en-US"/>
+        </w:rPr>
+        <w:t>emulated computer games</w:t>
+      </w:r>
+      <w:r>
+        <w:rPr>
+          <w:lang w:val="en-US"/>
+        </w:rPr>
+        <w:t xml:space="preserve"> or “a screen film of an app”.</w:t>
+      </w:r>
+      <w:r>
+        <w:rPr>
+          <w:rStyle w:val="Fodnotehenvisning"/>
+          <w:lang w:val="en-US"/>
+        </w:rPr>
+        <w:footnoteReference w:id="6"/>
+      </w:r>
+    </w:p>
+    <w:p>
+      <w:pPr>
+        <w:rPr>
+          <w:lang w:val="en-US"/>
+        </w:rPr>
+      </w:pPr>
+      <w:r>
+        <w:rPr>
+          <w:lang w:val="en-US"/>
+        </w:rPr>
+        <w:t>While digitized source criticism centers on analogue-to</w:t>
+      </w:r>
+      <w:r>
+        <w:rPr>
+          <w:lang w:val="en-US"/>
+        </w:rPr>
+        <w:t xml:space="preserve">-digital selection bias, reborn digital source criticism must interrogate the technical preservation pipeline as well as any </w:t>
+      </w:r>
+      <w:r>
+        <w:rPr>
+          <w:lang w:val="en-US"/>
+        </w:rPr>
+        <w:t>algorithmic or policy-driven selection biases.</w:t>
+      </w:r>
+    </w:p>
+    <w:p>
+      <w:pPr>
+        <w:rPr>
+          <w:lang w:val="en-US"/>
+        </w:rPr>
+      </w:pPr>
+    </w:p>
+    <w:p>
+      <w:pPr>
+        <w:pStyle w:val="Overskrift2"/>
+        <w:rPr>
+          <w:lang w:val="en-US"/>
+        </w:rPr>
+      </w:pPr>
+      <w:r>
+        <w:rPr>
+          <w:lang w:val="en-US"/>
+        </w:rPr>
+        <w:lastRenderedPageBreak/>
+        <w:t>Database collections in practice</w:t>
+      </w:r>
+    </w:p>
+    <w:p>
+      <w:pPr>
         <w:rPr>
           <w:rFonts w:ascii="Aptos" w:eastAsia="Aptos" w:hAnsi="Aptos" w:cs="Aptos"/>
+          <w:b/>
+          <w:bCs/>
           <w:lang w:val="en-US"/>
         </w:rPr>
       </w:pPr>
@@ -2248,7 +2617,7 @@
           <w:rFonts w:ascii="Aptos" w:eastAsia="Aptos" w:hAnsi="Aptos" w:cs="Aptos"/>
           <w:lang w:val="en-US"/>
         </w:rPr>
-        <w:footnoteReference w:id="6"/>
+        <w:footnoteReference w:id="7"/>
       </w:r>
       <w:r>
         <w:rPr>
@@ -2305,14 +2674,7 @@
           <w:rFonts w:ascii="Aptos" w:eastAsia="Aptos" w:hAnsi="Aptos" w:cs="Aptos"/>
           <w:lang w:val="en-US"/>
         </w:rPr>
-        <w:footnoteReference w:id="7"/>
-      </w:r>
-      <w:r>
-        <w:rPr>
-          <w:rFonts w:ascii="Aptos" w:eastAsia="Aptos" w:hAnsi="Aptos" w:cs="Aptos"/>
-          <w:lang w:val="en-US"/>
-        </w:rPr>
-        <w:t xml:space="preserve"> </w:t>
+        <w:footnoteReference w:id="8"/>
       </w:r>
     </w:p>
     <w:sectPr>
@@ -2447,7 +2809,7 @@
         <w:rPr>
           <w:lang w:val="en-US"/>
         </w:rPr>
-        <w:instrText xml:space="preserve"> ADDIN ZOTERO_ITEM CSL_CITATION {"citationID":"PzFN25Fr","properties":{"formattedCitation":"\\uc0\\u8216{}David P. Boder Interviews Anna Braun, September 20, 1946, Munich, Germany\\uc0\\u8217{}, accessed 23 April 2026, https://iit.aviaryplatform.com/collections/231/collection_resources/17593/transcript.","plainCitation":"‘David P. Boder Interviews Anna Braun, September 20, 1946, Munich, Germany’, accessed 23 April 2026, https://iit.aviaryplatform.com/collections/231/collection_resources/17593/transcript.","noteIndex":1},"citationItems":[{"id":118,"uris":["http://zotero.org/users/18770560/items/A545SLJY"],"itemData":{"id":118,"type":"webpage","abstract":"Interview with Anna Braun conducted by David P. Boder on September 20, 1946 at the Funkkaserne displaced-person's camp in Munich, Germany.","language":"en-US","title":"David P. Boder Interviews Anna Braun, September 20, 1946, Munich, Germany","URL":"https://iit.aviaryplatform.com/collections/231/collection_resources/17593/transcript","accessed":{"date-parts":[["2026",4,23]]}}}],"schema":"https://github.com/citation-style-language/schema/raw/master/csl-citation.json"} </w:instrText>
+        <w:instrText xml:space="preserve"> ADDIN ZOTERO_ITEM CSL_CITATION {"citationID":"PzFN25Fr","properties":{"formattedCitation":"\\uc0\\u8216{}David P. Boder Interviews Anna Braun, September 20, 1946, Munich, Germany\\uc0\\u8217{}, accessed 23 April 2026, https://iit.aviaryplatform.com/collections/231/collection_resources/17593/transcript.","plainCitation":"‘David P. Boder Interviews Anna Braun, September 20, 1946, Munich, Germany’, accessed 23 April 2026, https://iit.aviaryplatform.com/collections/231/collection_resources/17593/transcript.","noteIndex":2},"citationItems":[{"id":118,"uris":["http://zotero.org/users/18770560/items/A545SLJY"],"itemData":{"id":118,"type":"webpage","abstract":"Interview with Anna Braun conducted by David P. Boder on September 20, 1946 at the Funkkaserne displaced-person's camp in Munich, Germany.","language":"en-US","title":"David P. Boder Interviews Anna Braun, September 20, 1946, Munich, Germany","URL":"https://iit.aviaryplatform.com/collections/231/collection_resources/17593/transcript","accessed":{"date-parts":[["2026",4,23]]}}}],"schema":"https://github.com/citation-style-language/schema/raw/master/csl-citation.json"} </w:instrText>
       </w:r>
       <w:r>
         <w:fldChar w:fldCharType="separate"/>
@@ -2492,7 +2854,7 @@
         <w:rPr>
           <w:lang w:val="en-US"/>
         </w:rPr>
-        <w:instrText xml:space="preserve"> ADDIN ZOTERO_ITEM CSL_CITATION {"citationID":"TMZSHHKK","properties":{"formattedCitation":"Helle Strandgaard Jensen, \\uc0\\u8216{}Digital Archival Literacy for (All) Historians\\uc0\\u8217{}, {\\i{}Media History} 27, no. 2 (2021): 251\\uc0\\u8211{}65, https://doi.org/10.1080/13688804.2020.1779047.","plainCitation":"Helle Strandgaard Jensen, ‘Digital Archival Literacy for (All) Historians’, Media History 27, no. 2 (2021): 251–65, https://doi.org/10.1080/13688804.2020.1779047.","noteIndex":2},"citationItems":[{"id":120,"uris":["http://zotero.org/users/18770560/items/YVNKERVM"],"itemData":{"id":120,"type":"article-journal","container-title":"Media History","DOI":"10.1080/13688804.2020.1779047","ISSN":"1368-8804, 1469-9729","issue":"2","journalAbbreviation":"Media History","language":"en","page":"251-265","source":"DOI.org (Crossref)","title":"Digital Archival Literacy for (All) Historians","volume":"27","author":[{"family":"Jensen","given":"Helle Strandgaard"}],"issued":{"date-parts":[["2021",4,3]]}}}],"schema":"https://github.com/citation-style-language/schema/raw/master/csl-citation.json"} </w:instrText>
+        <w:instrText xml:space="preserve"> ADDIN ZOTERO_ITEM CSL_CITATION {"citationID":"BMD8Si3D","properties":{"formattedCitation":"Helle Strandgaard Jensen, \\uc0\\u8216{}Digital Archival Literacy for (All) Historians\\uc0\\u8217{}, {\\i{}Media History} 27, no. 2 (2021): 251\\uc0\\u8211{}65, https://doi.org/10.1080/13688804.2020.1779047.","plainCitation":"Helle Strandgaard Jensen, ‘Digital Archival Literacy for (All) Historians’, Media History 27, no. 2 (2021): 251–65, https://doi.org/10.1080/13688804.2020.1779047.","noteIndex":3},"citationItems":[{"id":120,"uris":["http://zotero.org/users/18770560/items/YVNKERVM"],"itemData":{"id":120,"type":"article-journal","container-title":"Media History","DOI":"10.1080/13688804.2020.1779047","ISSN":"1368-8804, 1469-9729","issue":"2","journalAbbreviation":"Media History","language":"en","page":"251-265","source":"DOI.org (Crossref)","title":"Digital Archival Literacy for (All) Historians","volume":"27","author":[{"family":"Jensen","given":"Helle Strandgaard"}],"issued":{"date-parts":[["2021",4,3]]}}}],"schema":"https://github.com/citation-style-language/schema/raw/master/csl-citation.json"} </w:instrText>
       </w:r>
       <w:r>
         <w:fldChar w:fldCharType="separate"/>
@@ -2555,7 +2917,7 @@
         <w:rPr>
           <w:lang w:val="en-US"/>
         </w:rPr>
-        <w:instrText xml:space="preserve"> ADDIN ZOTERO_ITEM CSL_CITATION {"citationID":"BMD8Si3D","properties":{"formattedCitation":"Jensen, \\uc0\\u8216{}Digital Archival Literacy for (All) Historians\\uc0\\u8217{}.","plainCitation":"Jensen, ‘Digital Archival Literacy for (All) Historians’.","noteIndex":3},"citationItems":[{"id":120,"uris":["http://zotero.org/users/18770560/items/YVNKERVM"],"itemData":{"id":120,"type":"article-journal","container-title":"Media History","DOI":"10.1080/13688804.2020.1779047","ISSN":"1368-8804, 1469-9729","issue":"2","journalAbbreviation":"Media History","language":"en","page":"251-265","source":"DOI.org (Crossref)","title":"Digital Archival Literacy for (All) Historians","volume":"27","author":[{"family":"Jensen","given":"Helle Strandgaard"}],"issued":{"date-parts":[["2021",4,3]]}}}],"schema":"https://github.com/citation-style-language/schema/raw/master/csl-citation.json"} </w:instrText>
+        <w:instrText xml:space="preserve"> ADDIN ZOTERO_ITEM CSL_CITATION {"citationID":"69pnXcfk","properties":{"formattedCitation":"Jessica Marie Johnson, \\uc0\\u8216{}Markup Bodies\\uc0\\u8217{}, {\\i{}Social Text} 36, no. 4 (2018): 57\\uc0\\u8211{}79, https://doi.org/10.1215/01642472-7145658.","plainCitation":"Jessica Marie Johnson, ‘Markup Bodies’, Social Text 36, no. 4 (2018): 57–79, https://doi.org/10.1215/01642472-7145658.","noteIndex":4},"citationItems":[{"id":123,"uris":["http://zotero.org/users/18770560/items/IAT2XD7W"],"itemData":{"id":123,"type":"article-journal","container-title":"Social Text","DOI":"10.1215/01642472-7145658","ISSN":"0164-2472, 1527-1951","issue":"4","language":"en","page":"57-79","source":"DOI.org (Crossref)","title":"Markup Bodies","volume":"36","author":[{"family":"Johnson","given":"Jessica Marie"}],"issued":{"date-parts":[["2018",12,1]]}}}],"schema":"https://github.com/citation-style-language/schema/raw/master/csl-citation.json"} </w:instrText>
       </w:r>
       <w:r>
         <w:fldChar w:fldCharType="separate"/>
@@ -2566,7 +2928,25 @@
           <w:kern w:val="0"/>
           <w:lang w:val="en-US"/>
         </w:rPr>
-        <w:t>Jensen, ‘Digital Archival Literacy for (All) Historians’.</w:t>
+        <w:t xml:space="preserve">Jessica Marie Johnson, ‘Markup Bodies’, </w:t>
+      </w:r>
+      <w:r>
+        <w:rPr>
+          <w:rFonts w:ascii="Aptos" w:hAnsi="Aptos" w:cs="Times New Roman"/>
+          <w:i/>
+          <w:iCs/>
+          <w:kern w:val="0"/>
+          <w:lang w:val="en-US"/>
+        </w:rPr>
+        <w:t>Social Text</w:t>
+      </w:r>
+      <w:r>
+        <w:rPr>
+          <w:rFonts w:ascii="Aptos" w:hAnsi="Aptos" w:cs="Times New Roman"/>
+          <w:kern w:val="0"/>
+          <w:lang w:val="en-US"/>
+        </w:rPr>
+        <w:t xml:space="preserve"> 36, no. 4 (2018): 57–79, https://doi.org/10.1215/01642472-7145658.</w:t>
       </w:r>
       <w:r>
         <w:fldChar w:fldCharType="end"/>
@@ -2600,7 +2980,7 @@
         <w:rPr>
           <w:lang w:val="en-US"/>
         </w:rPr>
-        <w:instrText xml:space="preserve"> ADDIN ZOTERO_ITEM CSL_CITATION {"citationID":"69pnXcfk","properties":{"formattedCitation":"Jessica Marie Johnson, \\uc0\\u8216{}Markup Bodies\\uc0\\u8217{}, {\\i{}Social Text} 36, no. 4 (2018): 57\\uc0\\u8211{}79, https://doi.org/10.1215/01642472-7145658.","plainCitation":"Jessica Marie Johnson, ‘Markup Bodies’, Social Text 36, no. 4 (2018): 57–79, https://doi.org/10.1215/01642472-7145658.","noteIndex":4},"citationItems":[{"id":123,"uris":["http://zotero.org/users/18770560/items/IAT2XD7W"],"itemData":{"id":123,"type":"article-journal","container-title":"Social Text","DOI":"10.1215/01642472-7145658","ISSN":"0164-2472, 1527-1951","issue":"4","language":"en","page":"57-79","source":"DOI.org (Crossref)","title":"Markup Bodies","volume":"36","author":[{"family":"Johnson","given":"Jessica Marie"}],"issued":{"date-parts":[["2018",12,1]]}}}],"schema":"https://github.com/citation-style-language/schema/raw/master/csl-citation.json"} </w:instrText>
+        <w:instrText xml:space="preserve"> ADDIN ZOTERO_ITEM CSL_CITATION {"citationID":"3k7OTF6E","properties":{"formattedCitation":"Niels Br\\uc0\\u252{}gger, \\uc0\\u8216{}Understanding the Archived Web as a Historical Source\\uc0\\u8217{}, in {\\i{}The SAGE Handbook of Web History}, by Niels Br\\uc0\\u252{}gger and Ian Milligan (SAGE Publications Ltd, 2019), https://doi.org/10.4135/9781526470546.n2.","plainCitation":"Niels Brügger, ‘Understanding the Archived Web as a Historical Source’, in The SAGE Handbook of Web History, by Niels Brügger and Ian Milligan (SAGE Publications Ltd, 2019), https://doi.org/10.4135/9781526470546.n2.","noteIndex":5},"citationItems":[{"id":156,"uris":["http://zotero.org/users/18770560/items/M3BB5WVI"],"itemData":{"id":156,"type":"chapter","container-title":"The SAGE Handbook of Web History","DOI":"10.4135/9781526470546.n2","ISBN":"978-1-4739-8005-1","page":"16-29","publisher":"SAGE Publications Ltd","publisher-place":"1 Oliver’s Yard, 55 City Road London EC1Y 1SP","source":"DOI.org (Crossref)","title":"Understanding the Archived Web as a Historical Source","URL":"https://sk.sagepub.com/reference/the-sage-handbook-of-web-history/i556.xml","container-author":[{"family":"Brügger","given":"Niels"},{"family":"Milligan","given":"Ian"}],"author":[{"family":"Brügger","given":"Niels"}],"accessed":{"date-parts":[["2026",7,30]]},"issued":{"date-parts":[["2019"]]}}}],"schema":"https://github.com/citation-style-language/schema/raw/master/csl-citation.json"} </w:instrText>
       </w:r>
       <w:r>
         <w:fldChar w:fldCharType="separate"/>
@@ -2611,7 +2991,7 @@
           <w:kern w:val="0"/>
           <w:lang w:val="en-US"/>
         </w:rPr>
-        <w:t xml:space="preserve">Jessica Marie Johnson, ‘Markup Bodies’, </w:t>
+        <w:t xml:space="preserve">Niels Brügger, ‘Understanding the Archived Web as a Historical Source’, in </w:t>
       </w:r>
       <w:r>
         <w:rPr>
@@ -2621,7 +3001,7 @@
           <w:kern w:val="0"/>
           <w:lang w:val="en-US"/>
         </w:rPr>
-        <w:t>Social Text</w:t>
+        <w:t>The SAGE Handbook of Web History</w:t>
       </w:r>
       <w:r>
         <w:rPr>
@@ -2629,7 +3009,7 @@
           <w:kern w:val="0"/>
           <w:lang w:val="en-US"/>
         </w:rPr>
-        <w:t xml:space="preserve"> 36, no. 4 (2018): 57–79, https://doi.org/10.1215/01642472-7145658.</w:t>
+        <w:t>, by Niels Brügger and Ian Milligan (SAGE Publications Ltd, 2019), https://doi.org/10.4135/9781526470546.n2.</w:t>
       </w:r>
       <w:r>
         <w:fldChar w:fldCharType="end"/>
@@ -2637,6 +3017,51 @@
     </w:p>
   </w:footnote>
   <w:footnote w:id="6">
+    <w:p>
+      <w:pPr>
+        <w:pStyle w:val="Fodnotetekst"/>
+        <w:rPr>
+          <w:lang w:val="en-US"/>
+        </w:rPr>
+      </w:pPr>
+      <w:r>
+        <w:rPr>
+          <w:rStyle w:val="Fodnotehenvisning"/>
+        </w:rPr>
+        <w:footnoteRef/>
+      </w:r>
+      <w:r>
+        <w:rPr>
+          <w:lang w:val="en-US"/>
+        </w:rPr>
+        <w:t xml:space="preserve"> </w:t>
+      </w:r>
+      <w:r>
+        <w:fldChar w:fldCharType="begin"/>
+      </w:r>
+      <w:r>
+        <w:rPr>
+          <w:lang w:val="en-US"/>
+        </w:rPr>
+        <w:instrText xml:space="preserve"> ADDIN ZOTERO_ITEM CSL_CITATION {"citationID":"DFudcRqp","properties":{"formattedCitation":"Br\\uc0\\u252{}gger, \\uc0\\u8216{}Understanding the Archived Web as a Historical Source\\uc0\\u8217{}.","plainCitation":"Brügger, ‘Understanding the Archived Web as a Historical Source’.","noteIndex":6},"citationItems":[{"id":156,"uris":["http://zotero.org/users/18770560/items/M3BB5WVI"],"itemData":{"id":156,"type":"chapter","container-title":"The SAGE Handbook of Web History","DOI":"10.4135/9781526470546.n2","ISBN":"978-1-4739-8005-1","page":"16-29","publisher":"SAGE Publications Ltd","publisher-place":"1 Oliver’s Yard, 55 City Road London EC1Y 1SP","source":"DOI.org (Crossref)","title":"Understanding the Archived Web as a Historical Source","URL":"https://sk.sagepub.com/reference/the-sage-handbook-of-web-history/i556.xml","container-author":[{"family":"Brügger","given":"Niels"},{"family":"Milligan","given":"Ian"}],"author":[{"family":"Brügger","given":"Niels"}],"accessed":{"date-parts":[["2026",7,30]]},"issued":{"date-parts":[["2019"]]}}}],"schema":"https://github.com/citation-style-language/schema/raw/master/csl-citation.json"} </w:instrText>
+      </w:r>
+      <w:r>
+        <w:fldChar w:fldCharType="separate"/>
+      </w:r>
+      <w:r>
+        <w:rPr>
+          <w:rFonts w:ascii="Aptos" w:hAnsi="Aptos" w:cs="Times New Roman"/>
+          <w:kern w:val="0"/>
+          <w:lang w:val="en-US"/>
+        </w:rPr>
+        <w:t>Brügger, ‘Understanding the Archived Web as a Historical Source’.</w:t>
+      </w:r>
+      <w:r>
+        <w:fldChar w:fldCharType="end"/>
+      </w:r>
+    </w:p>
+  </w:footnote>
+  <w:footnote w:id="7">
     <w:p>
       <w:pPr>
         <w:pStyle w:val="Fodnotetekst"/>
@@ -2687,7 +3112,7 @@
       </w:r>
     </w:p>
   </w:footnote>
-  <w:footnote w:id="7">
+  <w:footnote w:id="8">
     <w:p>
       <w:pPr>
         <w:pStyle w:val="Fodnotetekst"/>
@@ -2714,7 +3139,7 @@
         <w:rPr>
           <w:lang w:val="en-US"/>
         </w:rPr>
-        <w:instrText xml:space="preserve"> ADDIN ZOTERO_ITEM CSL_CITATION {"citationID":"69pnXcfk","properties":{"formattedCitation":"Jessica Marie Johnson, \\uc0\\u8216{}Markup Bodies\\uc0\\u8217{}, {\\i{}Social Text} 36, no. 4 (2018): 57\\uc0\\u8211{}79, https://doi.org/10.1215/01642472-7145658.","plainCitation":"Jessica Marie Johnson, ‘Markup Bodies’, Social Text 36, no. 4 (2018): 57–79, https://doi.org/10.1215/01642472-7145658.","noteIndex":4},"citationItems":[{"id":123,"uris":["http://zotero.org/users/18770560/items/IAT2XD7W"],"itemData":{"id":123,"type":"article-journal","container-title":"Social Text","DOI":"10.1215/01642472-7145658","ISSN":"0164-2472, 1527-1951","issue":"4","language":"en","page":"57-79","source":"DOI.org (Crossref)","title":"Markup Bodies","volume":"36","author":[{"family":"Johnson","given":"Jessica Marie"}],"issued":{"date-parts":[["2018",12,1]]}}}],"schema":"https://github.com/citation-style-language/schema/raw/master/csl-citation.json"} </w:instrText>
+        <w:instrText xml:space="preserve"> ADDIN ZOTERO_ITEM CSL_CITATION {"citationID":"ztI8M8Xn","properties":{"formattedCitation":"Johnson, \\uc0\\u8216{}Markup Bodies\\uc0\\u8217{}.","plainCitation":"Johnson, ‘Markup Bodies’.","noteIndex":7},"citationItems":[{"id":123,"uris":["http://zotero.org/users/18770560/items/IAT2XD7W"],"itemData":{"id":123,"type":"article-journal","container-title":"Social Text","DOI":"10.1215/01642472-7145658","ISSN":"0164-2472, 1527-1951","issue":"4","language":"en","page":"57-79","source":"DOI.org (Crossref)","title":"Markup Bodies","volume":"36","author":[{"family":"Johnson","given":"Jessica Marie"}],"issued":{"date-parts":[["2018",12,1]]}}}],"schema":"https://github.com/citation-style-language/schema/raw/master/csl-citation.json"} </w:instrText>
       </w:r>
       <w:r>
         <w:fldChar w:fldCharType="separate"/>
@@ -2722,25 +3147,9 @@
       <w:r>
         <w:rPr>
           <w:rFonts w:ascii="Aptos" w:hAnsi="Aptos" w:cs="Times New Roman"/>
-          <w:lang w:val="en-US"/>
-        </w:rPr>
-        <w:t xml:space="preserve">Jessica Marie Johnson, ‘Markup Bodies’, </w:t>
-      </w:r>
-      <w:r>
-        <w:rPr>
-          <w:rFonts w:ascii="Aptos" w:hAnsi="Aptos" w:cs="Times New Roman"/>
-          <w:i/>
-          <w:iCs/>
-          <w:lang w:val="en-US"/>
-        </w:rPr>
-        <w:t>Social Text</w:t>
-      </w:r>
-      <w:r>
-        <w:rPr>
-          <w:rFonts w:ascii="Aptos" w:hAnsi="Aptos" w:cs="Times New Roman"/>
-          <w:lang w:val="en-US"/>
-        </w:rPr>
-        <w:t xml:space="preserve"> 36, no. 4 (2018): 57–79, https://doi.org/10.1215/01642472-7145658.</w:t>
+          <w:kern w:val="0"/>
+        </w:rPr>
+        <w:t>Johnson, ‘Markup Bodies’.</w:t>
       </w:r>
       <w:r>
         <w:fldChar w:fldCharType="end"/>
@@ -10432,23 +10841,10 @@
 </file>
 
 <file path=customXml/item1.xml><?xml version="1.0" encoding="utf-8"?>
-<?mso-contentType ?>
-<FormTemplates xmlns="http://schemas.microsoft.com/sharepoint/v3/contenttype/forms">
-  <Display>DocumentLibraryForm</Display>
-  <Edit>DocumentLibraryForm</Edit>
-  <New>DocumentLibraryForm</New>
-</FormTemplates>
+<b:Sources xmlns:b="http://schemas.openxmlformats.org/officeDocument/2006/bibliography" xmlns="http://schemas.openxmlformats.org/officeDocument/2006/bibliography" SelectedStyle="\APASixthEditionOfficeOnline.xsl" StyleName="APA" Version="6"/>
 </file>
 
 <file path=customXml/item2.xml><?xml version="1.0" encoding="utf-8"?>
-<p:properties xmlns:p="http://schemas.microsoft.com/office/2006/metadata/properties" xmlns:xsi="http://www.w3.org/2001/XMLSchema-instance" xmlns:pc="http://schemas.microsoft.com/office/infopath/2007/PartnerControls">
-  <documentManagement>
-    <_activity xmlns="b9d24f27-df9e-4bb2-b407-443439d313ec" xsi:nil="true"/>
-  </documentManagement>
-</p:properties>
-</file>
-
-<file path=customXml/item3.xml><?xml version="1.0" encoding="utf-8"?>
 <ct:contentTypeSchema xmlns:ct="http://schemas.microsoft.com/office/2006/metadata/contentType" xmlns:ma="http://schemas.microsoft.com/office/2006/metadata/properties/metaAttributes" ct:_="" ma:_="" ma:contentTypeName="Dokument" ma:contentTypeID="0x010100E8E6746424E1934CBE3F536F31989882" ma:contentTypeVersion="5" ma:contentTypeDescription="Opret et nyt dokument." ma:contentTypeScope="" ma:versionID="26ff9db5842dcb6c575e2fcd49116ad2">
   <xsd:schema xmlns:xsd="http://www.w3.org/2001/XMLSchema" xmlns:xs="http://www.w3.org/2001/XMLSchema" xmlns:p="http://schemas.microsoft.com/office/2006/metadata/properties" xmlns:ns3="b9d24f27-df9e-4bb2-b407-443439d313ec" targetNamespace="http://schemas.microsoft.com/office/2006/metadata/properties" ma:root="true" ma:fieldsID="6c92312199131e221362ead87b4a9a7e" ns3:_="">
     <xsd:import namespace="b9d24f27-df9e-4bb2-b407-443439d313ec"/>
@@ -10598,29 +10994,32 @@
 </ct:contentTypeSchema>
 </file>
 
+<file path=customXml/item3.xml><?xml version="1.0" encoding="utf-8"?>
+<?mso-contentType ?>
+<FormTemplates xmlns="http://schemas.microsoft.com/sharepoint/v3/contenttype/forms">
+  <Display>DocumentLibraryForm</Display>
+  <Edit>DocumentLibraryForm</Edit>
+  <New>DocumentLibraryForm</New>
+</FormTemplates>
+</file>
+
 <file path=customXml/item4.xml><?xml version="1.0" encoding="utf-8"?>
-<b:Sources xmlns:b="http://schemas.openxmlformats.org/officeDocument/2006/bibliography" xmlns="http://schemas.openxmlformats.org/officeDocument/2006/bibliography" SelectedStyle="\APASixthEditionOfficeOnline.xsl" StyleName="APA" Version="6"/>
+<p:properties xmlns:p="http://schemas.microsoft.com/office/2006/metadata/properties" xmlns:xsi="http://www.w3.org/2001/XMLSchema-instance" xmlns:pc="http://schemas.microsoft.com/office/infopath/2007/PartnerControls">
+  <documentManagement>
+    <_activity xmlns="b9d24f27-df9e-4bb2-b407-443439d313ec" xsi:nil="true"/>
+  </documentManagement>
+</p:properties>
 </file>
 
 <file path=customXml/itemProps1.xml><?xml version="1.0" encoding="utf-8"?>
-<ds:datastoreItem xmlns:ds="http://schemas.openxmlformats.org/officeDocument/2006/customXml" ds:itemID="{24B7C4D6-5EDB-4118-AC26-5450F5CD9CDA}">
+<ds:datastoreItem xmlns:ds="http://schemas.openxmlformats.org/officeDocument/2006/customXml" ds:itemID="{2809BB27-94B8-4525-AC7D-40C64968795C}">
   <ds:schemaRefs>
-    <ds:schemaRef ds:uri="http://schemas.microsoft.com/sharepoint/v3/contenttype/forms"/>
+    <ds:schemaRef ds:uri="http://schemas.openxmlformats.org/officeDocument/2006/bibliography"/>
   </ds:schemaRefs>
 </ds:datastoreItem>
 </file>
 
 <file path=customXml/itemProps2.xml><?xml version="1.0" encoding="utf-8"?>
-<ds:datastoreItem xmlns:ds="http://schemas.openxmlformats.org/officeDocument/2006/customXml" ds:itemID="{CAF4FED6-B776-4F67-BB6C-6B85E70B53B6}">
-  <ds:schemaRefs>
-    <ds:schemaRef ds:uri="http://schemas.microsoft.com/office/2006/metadata/properties"/>
-    <ds:schemaRef ds:uri="http://schemas.microsoft.com/office/infopath/2007/PartnerControls"/>
-    <ds:schemaRef ds:uri="b9d24f27-df9e-4bb2-b407-443439d313ec"/>
-  </ds:schemaRefs>
-</ds:datastoreItem>
-</file>
-
-<file path=customXml/itemProps3.xml><?xml version="1.0" encoding="utf-8"?>
 <ds:datastoreItem xmlns:ds="http://schemas.openxmlformats.org/officeDocument/2006/customXml" ds:itemID="{86579CBC-84C4-4B00-A4F8-9E9885EA5CD3}">
   <ds:schemaRefs>
     <ds:schemaRef ds:uri="http://schemas.microsoft.com/office/2006/metadata/contentType"/>
@@ -10638,10 +11037,20 @@
 </ds:datastoreItem>
 </file>
 
+<file path=customXml/itemProps3.xml><?xml version="1.0" encoding="utf-8"?>
+<ds:datastoreItem xmlns:ds="http://schemas.openxmlformats.org/officeDocument/2006/customXml" ds:itemID="{24B7C4D6-5EDB-4118-AC26-5450F5CD9CDA}">
+  <ds:schemaRefs>
+    <ds:schemaRef ds:uri="http://schemas.microsoft.com/sharepoint/v3/contenttype/forms"/>
+  </ds:schemaRefs>
+</ds:datastoreItem>
+</file>
+
 <file path=customXml/itemProps4.xml><?xml version="1.0" encoding="utf-8"?>
-<ds:datastoreItem xmlns:ds="http://schemas.openxmlformats.org/officeDocument/2006/customXml" ds:itemID="{2809BB27-94B8-4525-AC7D-40C64968795C}">
+<ds:datastoreItem xmlns:ds="http://schemas.openxmlformats.org/officeDocument/2006/customXml" ds:itemID="{CAF4FED6-B776-4F67-BB6C-6B85E70B53B6}">
   <ds:schemaRefs>
-    <ds:schemaRef ds:uri="http://schemas.openxmlformats.org/officeDocument/2006/bibliography"/>
+    <ds:schemaRef ds:uri="http://schemas.microsoft.com/office/2006/metadata/properties"/>
+    <ds:schemaRef ds:uri="http://schemas.microsoft.com/office/infopath/2007/PartnerControls"/>
+    <ds:schemaRef ds:uri="b9d24f27-df9e-4bb2-b407-443439d313ec"/>
   </ds:schemaRefs>
 </ds:datastoreItem>
 </file>

</xml_diff>